<commit_message>
Say "Solution" instead of "Teacher solution"
Change the wording in the README code tables and in the Lesson 5 and
Lesson 8 plans (Word and PDF).

Co-Authored-By: Claude Opus 5.5 <noreply@anthropic.com>
</commit_message>
<xml_diff>
--- a/Curriculum/Lesson 8/Lesson Plan 8 - Code Implementation of Inverse Kinematics and Other Methods.docx
+++ b/Curriculum/Lesson 8/Lesson Plan 8 - Code Implementation of Inverse Kinematics and Other Methods.docx
@@ -833,7 +833,7 @@
           <w:rFonts w:ascii="Calibri" w:cs="Calibri" w:eastAsia="Calibri" w:hAnsi="Calibri"/>
           <w:rtl w:val="0"/>
         </w:rPr>
-        <w:t xml:space="preserve">arm.py from Lesson 5 (each pair’s own file, or the teacher solution), in the same folder as the Lesson 8 files</w:t>
+        <w:t xml:space="preserve">arm.py from Lesson 5 (each pair’s own file, or the solution), in the same folder as the Lesson 8 files</w:t>
       </w:r>
     </w:p>
     <w:p>
@@ -875,7 +875,7 @@
           <w:rFonts w:ascii="Calibri" w:cs="Calibri" w:eastAsia="Calibri" w:hAnsi="Calibri"/>
           <w:rtl w:val="0"/>
         </w:rPr>
-        <w:t xml:space="preserve">Teacher solution: ik.py (the same code is on the slides, so hold the file back until students have tried it themselves). The code is in the Appendix</w:t>
+        <w:t xml:space="preserve">Solution: ik.py (the same code is on the slides, so hold the file back until students have tried it themselves). The code is in the Appendix</w:t>
       </w:r>
     </w:p>
     <w:p>
@@ -3014,7 +3014,7 @@
           <w:szCs w:val="26"/>
           <w:rtl w:val="0"/>
         </w:rPr>
-        <w:t xml:space="preserve">Appendix: ik.py (teacher solution)</w:t>
+        <w:t xml:space="preserve">Appendix: ik.py (solution)</w:t>
       </w:r>
     </w:p>
     <w:p>

</xml_diff>